<commit_message>
doc: customer package rebuilt with the production-readiness fixes
- firmware images (elf/hex/bin) and customer GUI builds rebuilt from fe73672
- User Manual, GUI Functional Description, Functional Test Procedure, Code Walkthrough and
  System Overview updated: Stop/Esc abort the instrument, Run disabled without a link,
  PASS/FAIL verdict after insulation, automatic report saving, Test details panel, per-net
  HV rail supervision, F01/F02/F03 fault latching, open hardware items
- FIRMWARE_INFO, README and MANIFEST refreshed

Co-Authored-By: Claude Sonnet 5.5 <noreply@anthropic.com>
</commit_message>
<xml_diff>
--- a/Customer_Package/0_Documents/1_System_Overview.docx
+++ b/Customer_Package/0_Documents/1_System_Overview.docx
@@ -2272,7 +2272,7 @@
       <w:r>
         <w:fldChar w:fldCharType="separate"/>
       </w:r>
-      <w:hyperlink w:anchor="_Toc243642549" w:history="1">
+      <w:hyperlink w:anchor="_Toc243681829" w:history="1">
         <w:r>
           <w:rPr>
             <w:rStyle w:val="Hyperlink"/>
@@ -2314,7 +2314,7 @@
             <w:noProof/>
             <w:webHidden/>
           </w:rPr>
-          <w:instrText xml:space="preserve"> PAGEREF _Toc243642549 \h </w:instrText>
+          <w:instrText xml:space="preserve"> PAGEREF _Toc243681829 \h </w:instrText>
         </w:r>
         <w:r>
           <w:rPr>
@@ -2358,7 +2358,7 @@
           <w:lang w:eastAsia="en-IN"/>
         </w:rPr>
       </w:pPr>
-      <w:hyperlink w:anchor="_Toc243642550" w:history="1">
+      <w:hyperlink w:anchor="_Toc243681830" w:history="1">
         <w:r>
           <w:rPr>
             <w:rStyle w:val="Hyperlink"/>
@@ -2400,7 +2400,7 @@
             <w:noProof/>
             <w:webHidden/>
           </w:rPr>
-          <w:instrText xml:space="preserve"> PAGEREF _Toc243642550 \h </w:instrText>
+          <w:instrText xml:space="preserve"> PAGEREF _Toc243681830 \h </w:instrText>
         </w:r>
         <w:r>
           <w:rPr>
@@ -2444,7 +2444,7 @@
           <w:lang w:eastAsia="en-IN"/>
         </w:rPr>
       </w:pPr>
-      <w:hyperlink w:anchor="_Toc243642551" w:history="1">
+      <w:hyperlink w:anchor="_Toc243681831" w:history="1">
         <w:r>
           <w:rPr>
             <w:rStyle w:val="Hyperlink"/>
@@ -2486,7 +2486,7 @@
             <w:noProof/>
             <w:webHidden/>
           </w:rPr>
-          <w:instrText xml:space="preserve"> PAGEREF _Toc243642551 \h </w:instrText>
+          <w:instrText xml:space="preserve"> PAGEREF _Toc243681831 \h </w:instrText>
         </w:r>
         <w:r>
           <w:rPr>
@@ -2530,7 +2530,7 @@
           <w:lang w:eastAsia="en-IN"/>
         </w:rPr>
       </w:pPr>
-      <w:hyperlink w:anchor="_Toc243642552" w:history="1">
+      <w:hyperlink w:anchor="_Toc243681832" w:history="1">
         <w:r>
           <w:rPr>
             <w:rStyle w:val="Hyperlink"/>
@@ -2572,7 +2572,7 @@
             <w:noProof/>
             <w:webHidden/>
           </w:rPr>
-          <w:instrText xml:space="preserve"> PAGEREF _Toc243642552 \h </w:instrText>
+          <w:instrText xml:space="preserve"> PAGEREF _Toc243681832 \h </w:instrText>
         </w:r>
         <w:r>
           <w:rPr>
@@ -2616,7 +2616,7 @@
           <w:lang w:eastAsia="en-IN"/>
         </w:rPr>
       </w:pPr>
-      <w:hyperlink w:anchor="_Toc243642553" w:history="1">
+      <w:hyperlink w:anchor="_Toc243681833" w:history="1">
         <w:r>
           <w:rPr>
             <w:rStyle w:val="Hyperlink"/>
@@ -2660,7 +2660,7 @@
             <w:noProof/>
             <w:webHidden/>
           </w:rPr>
-          <w:instrText xml:space="preserve"> PAGEREF _Toc243642553 \h </w:instrText>
+          <w:instrText xml:space="preserve"> PAGEREF _Toc243681833 \h </w:instrText>
         </w:r>
         <w:r>
           <w:rPr>
@@ -2704,7 +2704,7 @@
           <w:lang w:eastAsia="en-IN"/>
         </w:rPr>
       </w:pPr>
-      <w:hyperlink w:anchor="_Toc243642554" w:history="1">
+      <w:hyperlink w:anchor="_Toc243681834" w:history="1">
         <w:r>
           <w:rPr>
             <w:rStyle w:val="Hyperlink"/>
@@ -2748,7 +2748,7 @@
             <w:noProof/>
             <w:webHidden/>
           </w:rPr>
-          <w:instrText xml:space="preserve"> PAGEREF _Toc243642554 \h </w:instrText>
+          <w:instrText xml:space="preserve"> PAGEREF _Toc243681834 \h </w:instrText>
         </w:r>
         <w:r>
           <w:rPr>
@@ -2792,7 +2792,7 @@
           <w:lang w:eastAsia="en-IN"/>
         </w:rPr>
       </w:pPr>
-      <w:hyperlink w:anchor="_Toc243642555" w:history="1">
+      <w:hyperlink w:anchor="_Toc243681835" w:history="1">
         <w:r>
           <w:rPr>
             <w:rStyle w:val="Hyperlink"/>
@@ -2836,7 +2836,7 @@
             <w:noProof/>
             <w:webHidden/>
           </w:rPr>
-          <w:instrText xml:space="preserve"> PAGEREF _Toc243642555 \h </w:instrText>
+          <w:instrText xml:space="preserve"> PAGEREF _Toc243681835 \h </w:instrText>
         </w:r>
         <w:r>
           <w:rPr>
@@ -2880,7 +2880,7 @@
           <w:lang w:eastAsia="en-IN"/>
         </w:rPr>
       </w:pPr>
-      <w:hyperlink w:anchor="_Toc243642556" w:history="1">
+      <w:hyperlink w:anchor="_Toc243681836" w:history="1">
         <w:r>
           <w:rPr>
             <w:rStyle w:val="Hyperlink"/>
@@ -2922,7 +2922,7 @@
             <w:noProof/>
             <w:webHidden/>
           </w:rPr>
-          <w:instrText xml:space="preserve"> PAGEREF _Toc243642556 \h </w:instrText>
+          <w:instrText xml:space="preserve"> PAGEREF _Toc243681836 \h </w:instrText>
         </w:r>
         <w:r>
           <w:rPr>
@@ -2966,7 +2966,7 @@
           <w:lang w:eastAsia="en-IN"/>
         </w:rPr>
       </w:pPr>
-      <w:hyperlink w:anchor="_Toc243642557" w:history="1">
+      <w:hyperlink w:anchor="_Toc243681837" w:history="1">
         <w:r>
           <w:rPr>
             <w:rStyle w:val="Hyperlink"/>
@@ -3008,7 +3008,7 @@
             <w:noProof/>
             <w:webHidden/>
           </w:rPr>
-          <w:instrText xml:space="preserve"> PAGEREF _Toc243642557 \h </w:instrText>
+          <w:instrText xml:space="preserve"> PAGEREF _Toc243681837 \h </w:instrText>
         </w:r>
         <w:r>
           <w:rPr>
@@ -3052,7 +3052,7 @@
           <w:lang w:eastAsia="en-IN"/>
         </w:rPr>
       </w:pPr>
-      <w:hyperlink w:anchor="_Toc243642558" w:history="1">
+      <w:hyperlink w:anchor="_Toc243681838" w:history="1">
         <w:r>
           <w:rPr>
             <w:rStyle w:val="Hyperlink"/>
@@ -3094,7 +3094,7 @@
             <w:noProof/>
             <w:webHidden/>
           </w:rPr>
-          <w:instrText xml:space="preserve"> PAGEREF _Toc243642558 \h </w:instrText>
+          <w:instrText xml:space="preserve"> PAGEREF _Toc243681838 \h </w:instrText>
         </w:r>
         <w:r>
           <w:rPr>
@@ -3171,7 +3171,7 @@
       <w:r>
         <w:fldChar w:fldCharType="separate"/>
       </w:r>
-      <w:hyperlink w:anchor="_Toc243642559" w:history="1">
+      <w:hyperlink w:anchor="_Toc243681839" w:history="1">
         <w:r>
           <w:rPr>
             <w:rStyle w:val="Hyperlink"/>
@@ -3199,7 +3199,7 @@
             <w:noProof/>
             <w:webHidden/>
           </w:rPr>
-          <w:instrText xml:space="preserve"> PAGEREF _Toc243642559 \h </w:instrText>
+          <w:instrText xml:space="preserve"> PAGEREF _Toc243681839 \h </w:instrText>
         </w:r>
         <w:r>
           <w:rPr>
@@ -3242,7 +3242,7 @@
           <w:lang w:eastAsia="en-IN"/>
         </w:rPr>
       </w:pPr>
-      <w:hyperlink w:anchor="_Toc243642560" w:history="1">
+      <w:hyperlink w:anchor="_Toc243681840" w:history="1">
         <w:r>
           <w:rPr>
             <w:rStyle w:val="Hyperlink"/>
@@ -3270,7 +3270,7 @@
             <w:noProof/>
             <w:webHidden/>
           </w:rPr>
-          <w:instrText xml:space="preserve"> PAGEREF _Toc243642560 \h </w:instrText>
+          <w:instrText xml:space="preserve"> PAGEREF _Toc243681840 \h </w:instrText>
         </w:r>
         <w:r>
           <w:rPr>
@@ -3313,7 +3313,7 @@
           <w:lang w:eastAsia="en-IN"/>
         </w:rPr>
       </w:pPr>
-      <w:hyperlink w:anchor="_Toc243642561" w:history="1">
+      <w:hyperlink w:anchor="_Toc243681841" w:history="1">
         <w:r>
           <w:rPr>
             <w:rStyle w:val="Hyperlink"/>
@@ -3341,7 +3341,7 @@
             <w:noProof/>
             <w:webHidden/>
           </w:rPr>
-          <w:instrText xml:space="preserve"> PAGEREF _Toc243642561 \h </w:instrText>
+          <w:instrText xml:space="preserve"> PAGEREF _Toc243681841 \h </w:instrText>
         </w:r>
         <w:r>
           <w:rPr>
@@ -3417,7 +3417,7 @@
       <w:r>
         <w:fldChar w:fldCharType="separate"/>
       </w:r>
-      <w:hyperlink w:anchor="_Toc243642562" w:history="1">
+      <w:hyperlink w:anchor="_Toc243681842" w:history="1">
         <w:r>
           <w:rPr>
             <w:rStyle w:val="Hyperlink"/>
@@ -3445,7 +3445,7 @@
             <w:noProof/>
             <w:webHidden/>
           </w:rPr>
-          <w:instrText xml:space="preserve"> PAGEREF _Toc243642562 \h </w:instrText>
+          <w:instrText xml:space="preserve"> PAGEREF _Toc243681842 \h </w:instrText>
         </w:r>
         <w:r>
           <w:rPr>
@@ -3488,7 +3488,7 @@
           <w:lang w:eastAsia="en-IN"/>
         </w:rPr>
       </w:pPr>
-      <w:hyperlink w:anchor="_Toc243642563" w:history="1">
+      <w:hyperlink w:anchor="_Toc243681843" w:history="1">
         <w:r>
           <w:rPr>
             <w:rStyle w:val="Hyperlink"/>
@@ -3516,7 +3516,7 @@
             <w:noProof/>
             <w:webHidden/>
           </w:rPr>
-          <w:instrText xml:space="preserve"> PAGEREF _Toc243642563 \h </w:instrText>
+          <w:instrText xml:space="preserve"> PAGEREF _Toc243681843 \h </w:instrText>
         </w:r>
         <w:r>
           <w:rPr>
@@ -3559,7 +3559,7 @@
           <w:lang w:eastAsia="en-IN"/>
         </w:rPr>
       </w:pPr>
-      <w:hyperlink w:anchor="_Toc243642564" w:history="1">
+      <w:hyperlink w:anchor="_Toc243681844" w:history="1">
         <w:r>
           <w:rPr>
             <w:rStyle w:val="Hyperlink"/>
@@ -3587,7 +3587,7 @@
             <w:noProof/>
             <w:webHidden/>
           </w:rPr>
-          <w:instrText xml:space="preserve"> PAGEREF _Toc243642564 \h </w:instrText>
+          <w:instrText xml:space="preserve"> PAGEREF _Toc243681844 \h </w:instrText>
         </w:r>
         <w:r>
           <w:rPr>
@@ -3630,7 +3630,7 @@
           <w:lang w:eastAsia="en-IN"/>
         </w:rPr>
       </w:pPr>
-      <w:hyperlink w:anchor="_Toc243642565" w:history="1">
+      <w:hyperlink w:anchor="_Toc243681845" w:history="1">
         <w:r>
           <w:rPr>
             <w:rStyle w:val="Hyperlink"/>
@@ -3658,7 +3658,7 @@
             <w:noProof/>
             <w:webHidden/>
           </w:rPr>
-          <w:instrText xml:space="preserve"> PAGEREF _Toc243642565 \h </w:instrText>
+          <w:instrText xml:space="preserve"> PAGEREF _Toc243681845 \h </w:instrText>
         </w:r>
         <w:r>
           <w:rPr>
@@ -3710,7 +3710,7 @@
         <w:pStyle w:val="Heading1"/>
         <w:ind w:left="720" w:hanging="720"/>
       </w:pPr>
-      <w:bookmarkStart w:id="0" w:name="_Toc243642549"/>
+      <w:bookmarkStart w:id="0" w:name="_Toc243681829"/>
       <w:r>
         <w:lastRenderedPageBreak/>
         <w:t>What it is</w:t>
@@ -3746,7 +3746,7 @@
         <w:pStyle w:val="Heading1"/>
         <w:ind w:left="720" w:hanging="720"/>
       </w:pPr>
-      <w:bookmarkStart w:id="1" w:name="_Toc243642550"/>
+      <w:bookmarkStart w:id="1" w:name="_Toc243681830"/>
       <w:r>
         <w:lastRenderedPageBreak/>
         <w:t>Block diagram</w:t>
@@ -3764,7 +3764,7 @@
           <w:noProof/>
         </w:rPr>
         <w:drawing>
-          <wp:inline distT="0" distB="0" distL="0" distR="0" wp14:anchorId="01EE389D" wp14:editId="2AFE7F8E">
+          <wp:inline distT="0" distB="0" distL="0" distR="0" wp14:anchorId="025BA540" wp14:editId="10DF3835">
             <wp:extent cx="5161445" cy="6119999"/>
             <wp:effectExtent l="0" t="0" r="0" b="0"/>
             <wp:docPr id="888501832" name="Picture 888501832"/>
@@ -3805,7 +3805,7 @@
         <w:pStyle w:val="Caption"/>
         <w:jc w:val="center"/>
       </w:pPr>
-      <w:bookmarkStart w:id="2" w:name="_Toc243642559"/>
+      <w:bookmarkStart w:id="2" w:name="_Toc243681839"/>
       <w:r>
         <w:rPr>
           <w:rFonts w:ascii="Times New Roman" w:eastAsia="Times New Roman" w:hAnsi="Times New Roman" w:cs="Times New Roman"/>
@@ -3856,7 +3856,7 @@
         <w:pStyle w:val="Heading1"/>
         <w:ind w:left="720" w:hanging="720"/>
       </w:pPr>
-      <w:bookmarkStart w:id="3" w:name="_Toc243642551"/>
+      <w:bookmarkStart w:id="3" w:name="_Toc243681831"/>
       <w:r>
         <w:t>Features</w:t>
       </w:r>
@@ -4715,7 +4715,7 @@
         <w:pStyle w:val="Caption"/>
         <w:jc w:val="center"/>
       </w:pPr>
-      <w:bookmarkStart w:id="4" w:name="_Toc243642562"/>
+      <w:bookmarkStart w:id="4" w:name="_Toc243681842"/>
       <w:r>
         <w:rPr>
           <w:rFonts w:ascii="Times New Roman" w:eastAsia="Times New Roman" w:hAnsi="Times New Roman" w:cs="Times New Roman"/>
@@ -4766,7 +4766,7 @@
         <w:pStyle w:val="Heading1"/>
         <w:ind w:left="720" w:hanging="720"/>
       </w:pPr>
-      <w:bookmarkStart w:id="5" w:name="_Toc243642552"/>
+      <w:bookmarkStart w:id="5" w:name="_Toc243681832"/>
       <w:r>
         <w:t>Main tests: how they work</w:t>
       </w:r>
@@ -4776,7 +4776,7 @@
       <w:pPr>
         <w:pStyle w:val="Heading2"/>
       </w:pPr>
-      <w:bookmarkStart w:id="6" w:name="_Toc243642553"/>
+      <w:bookmarkStart w:id="6" w:name="_Toc243681833"/>
       <w:r>
         <w:t>Continuity</w:t>
       </w:r>
@@ -4843,7 +4843,7 @@
       <w:pPr>
         <w:pStyle w:val="Heading2"/>
       </w:pPr>
-      <w:bookmarkStart w:id="7" w:name="_Toc243642554"/>
+      <w:bookmarkStart w:id="7" w:name="_Toc243681834"/>
       <w:r>
         <w:t>Resistance</w:t>
       </w:r>
@@ -4937,7 +4937,7 @@
         </w:rPr>
         <w:lastRenderedPageBreak/>
         <w:drawing>
-          <wp:inline distT="0" distB="0" distL="0" distR="0" wp14:anchorId="00703DFD" wp14:editId="6D06BD64">
+          <wp:inline distT="0" distB="0" distL="0" distR="0" wp14:anchorId="5E7C0652" wp14:editId="570B6A0E">
             <wp:extent cx="5580000" cy="1913143"/>
             <wp:effectExtent l="0" t="0" r="0" b="0"/>
             <wp:docPr id="888501833" name="Picture 888501833"/>
@@ -4978,7 +4978,7 @@
         <w:pStyle w:val="Caption"/>
         <w:jc w:val="center"/>
       </w:pPr>
-      <w:bookmarkStart w:id="8" w:name="_Toc243642560"/>
+      <w:bookmarkStart w:id="8" w:name="_Toc243681840"/>
       <w:r>
         <w:rPr>
           <w:rFonts w:ascii="Times New Roman" w:eastAsia="Times New Roman" w:hAnsi="Times New Roman" w:cs="Times New Roman"/>
@@ -5047,7 +5047,7 @@
       <w:pPr>
         <w:pStyle w:val="Heading2"/>
       </w:pPr>
-      <w:bookmarkStart w:id="9" w:name="_Toc243642555"/>
+      <w:bookmarkStart w:id="9" w:name="_Toc243681835"/>
       <w:r>
         <w:t>Insulation (500 V)</w:t>
       </w:r>
@@ -5088,7 +5088,7 @@
         <w:rPr>
           <w:rFonts w:ascii="Times New Roman" w:eastAsia="Times New Roman" w:hAnsi="Times New Roman" w:cs="Times New Roman"/>
         </w:rPr>
-        <w:t>after the operator arms HV, the firmware runs a self-test (100 V with all relays open, checking the rail rises). For each net, the HV Card closes the net's high-side relay and every other low-side relay except the net's own. Only then does the DAC8830 raise the CA05P-5 supply to 500 V. Leakage flows through R3002 (1 MΩ) and R3004 (1 kΩ), and an AD7476 reads the voltage across R3004. Voltage is removed before the relays open.</w:t>
+        <w:t>after the operator arms HV, the firmware runs a self-test (100 V with all relays open, checking the rail rises). For each net, the HV Card closes the net's high-side relay and every other low-side relay except the net's own. Only then does the DAC8830 raise the CA05P-5 supply to 500 V. Leakage flows through R3002 (1 MΩ) and R3004 (1 kΩ), and an AD7476 reads the voltage across R3004. The HV_Sense rail monitor is read before each leakage reading (it must be within 0.5x to 1.5x of the expected level) and again after it, and the rail must be confirmed discharged before the relays open. A fault in the HV path stops the run and latches a fault.</w:t>
       </w:r>
     </w:p>
     <w:p>
@@ -5134,7 +5134,7 @@
         <w:pStyle w:val="Heading1"/>
         <w:ind w:left="720" w:hanging="720"/>
       </w:pPr>
-      <w:bookmarkStart w:id="10" w:name="_Toc243642556"/>
+      <w:bookmarkStart w:id="10" w:name="_Toc243681836"/>
       <w:r>
         <w:t>Pass and fail conditions</w:t>
       </w:r>
@@ -5529,7 +5529,7 @@
         <w:pStyle w:val="Caption"/>
         <w:jc w:val="center"/>
       </w:pPr>
-      <w:bookmarkStart w:id="11" w:name="_Toc243642563"/>
+      <w:bookmarkStart w:id="11" w:name="_Toc243681843"/>
       <w:r>
         <w:rPr>
           <w:rFonts w:ascii="Times New Roman" w:eastAsia="Times New Roman" w:hAnsi="Times New Roman" w:cs="Times New Roman"/>
@@ -5584,6 +5584,7 @@
         <w:rPr>
           <w:rFonts w:ascii="Times New Roman" w:eastAsia="Times New Roman" w:hAnsi="Times New Roman" w:cs="Times New Roman"/>
         </w:rPr>
+        <w:lastRenderedPageBreak/>
         <w:t>Every run ends with a count of passes and fails. Any fault stops the run and forces the instrument safe.</w:t>
       </w:r>
     </w:p>
@@ -5592,9 +5593,8 @@
         <w:pStyle w:val="Heading1"/>
         <w:ind w:left="720" w:hanging="720"/>
       </w:pPr>
-      <w:bookmarkStart w:id="12" w:name="_Toc243642557"/>
-      <w:r>
-        <w:lastRenderedPageBreak/>
+      <w:bookmarkStart w:id="12" w:name="_Toc243681837"/>
+      <w:r>
         <w:t>Support Tools</w:t>
       </w:r>
       <w:bookmarkEnd w:id="12"/>
@@ -6058,7 +6058,7 @@
         <w:pStyle w:val="Caption"/>
         <w:jc w:val="center"/>
       </w:pPr>
-      <w:bookmarkStart w:id="13" w:name="_Toc243642564"/>
+      <w:bookmarkStart w:id="13" w:name="_Toc243681844"/>
       <w:r>
         <w:rPr>
           <w:rFonts w:ascii="Times New Roman" w:eastAsia="Times New Roman" w:hAnsi="Times New Roman" w:cs="Times New Roman"/>
@@ -6109,7 +6109,7 @@
         <w:pStyle w:val="Heading1"/>
         <w:ind w:left="720" w:hanging="720"/>
       </w:pPr>
-      <w:bookmarkStart w:id="14" w:name="_Toc243642558"/>
+      <w:bookmarkStart w:id="14" w:name="_Toc243681838"/>
       <w:r>
         <w:t>Pin support</w:t>
       </w:r>
@@ -6593,7 +6593,7 @@
         <w:pStyle w:val="Caption"/>
         <w:jc w:val="center"/>
       </w:pPr>
-      <w:bookmarkStart w:id="15" w:name="_Toc243642565"/>
+      <w:bookmarkStart w:id="15" w:name="_Toc243681845"/>
       <w:r>
         <w:rPr>
           <w:rFonts w:ascii="Times New Roman" w:eastAsia="Times New Roman" w:hAnsi="Times New Roman" w:cs="Times New Roman"/>
@@ -6651,7 +6651,7 @@
         </w:rPr>
         <w:lastRenderedPageBreak/>
         <w:drawing>
-          <wp:inline distT="0" distB="0" distL="0" distR="0" wp14:anchorId="369CA528" wp14:editId="3278D044">
+          <wp:inline distT="0" distB="0" distL="0" distR="0" wp14:anchorId="6BF074FF" wp14:editId="02C559A5">
             <wp:extent cx="5580000" cy="3188571"/>
             <wp:effectExtent l="0" t="0" r="0" b="0"/>
             <wp:docPr id="888501834" name="Picture 888501834"/>
@@ -6692,7 +6692,7 @@
         <w:pStyle w:val="Caption"/>
         <w:jc w:val="center"/>
       </w:pPr>
-      <w:bookmarkStart w:id="16" w:name="_Toc243642561"/>
+      <w:bookmarkStart w:id="16" w:name="_Toc243681841"/>
       <w:r>
         <w:rPr>
           <w:rFonts w:ascii="Times New Roman" w:eastAsia="Times New Roman" w:hAnsi="Times New Roman" w:cs="Times New Roman"/>

</xml_diff>

<commit_message>
release: customer_release_v1 - Atulya Core Tech (ACT)
Final customer release of the HT_MK1 Harness Tester.

- company name Atulya Core Tech (ACT) in the document footers and properties and in the GUI
  footer credit line
- all six documents re-issued with refreshed screenshots (new credit line, insulation verdict)
- customer GUI and demo executables rebuilt
- Customer_Package/RELEASE_NOTES.md added; README and MANIFEST refreshed

Firmware images are unchanged from fe73672 (no firmware change in this release).

Co-Authored-By: Claude Sonnet 5.5 <noreply@anthropic.com>
</commit_message>
<xml_diff>
--- a/Customer_Package/0_Documents/1_System_Overview.docx
+++ b/Customer_Package/0_Documents/1_System_Overview.docx
@@ -2272,7 +2272,7 @@
       <w:r>
         <w:fldChar w:fldCharType="separate"/>
       </w:r>
-      <w:hyperlink w:anchor="_Toc243681829" w:history="1">
+      <w:hyperlink w:anchor="_Toc243682944" w:history="1">
         <w:r>
           <w:rPr>
             <w:rStyle w:val="Hyperlink"/>
@@ -2314,7 +2314,7 @@
             <w:noProof/>
             <w:webHidden/>
           </w:rPr>
-          <w:instrText xml:space="preserve"> PAGEREF _Toc243681829 \h </w:instrText>
+          <w:instrText xml:space="preserve"> PAGEREF _Toc243682944 \h </w:instrText>
         </w:r>
         <w:r>
           <w:rPr>
@@ -2358,7 +2358,7 @@
           <w:lang w:eastAsia="en-IN"/>
         </w:rPr>
       </w:pPr>
-      <w:hyperlink w:anchor="_Toc243681830" w:history="1">
+      <w:hyperlink w:anchor="_Toc243682945" w:history="1">
         <w:r>
           <w:rPr>
             <w:rStyle w:val="Hyperlink"/>
@@ -2400,7 +2400,7 @@
             <w:noProof/>
             <w:webHidden/>
           </w:rPr>
-          <w:instrText xml:space="preserve"> PAGEREF _Toc243681830 \h </w:instrText>
+          <w:instrText xml:space="preserve"> PAGEREF _Toc243682945 \h </w:instrText>
         </w:r>
         <w:r>
           <w:rPr>
@@ -2444,7 +2444,7 @@
           <w:lang w:eastAsia="en-IN"/>
         </w:rPr>
       </w:pPr>
-      <w:hyperlink w:anchor="_Toc243681831" w:history="1">
+      <w:hyperlink w:anchor="_Toc243682946" w:history="1">
         <w:r>
           <w:rPr>
             <w:rStyle w:val="Hyperlink"/>
@@ -2486,7 +2486,7 @@
             <w:noProof/>
             <w:webHidden/>
           </w:rPr>
-          <w:instrText xml:space="preserve"> PAGEREF _Toc243681831 \h </w:instrText>
+          <w:instrText xml:space="preserve"> PAGEREF _Toc243682946 \h </w:instrText>
         </w:r>
         <w:r>
           <w:rPr>
@@ -2530,7 +2530,7 @@
           <w:lang w:eastAsia="en-IN"/>
         </w:rPr>
       </w:pPr>
-      <w:hyperlink w:anchor="_Toc243681832" w:history="1">
+      <w:hyperlink w:anchor="_Toc243682947" w:history="1">
         <w:r>
           <w:rPr>
             <w:rStyle w:val="Hyperlink"/>
@@ -2572,7 +2572,7 @@
             <w:noProof/>
             <w:webHidden/>
           </w:rPr>
-          <w:instrText xml:space="preserve"> PAGEREF _Toc243681832 \h </w:instrText>
+          <w:instrText xml:space="preserve"> PAGEREF _Toc243682947 \h </w:instrText>
         </w:r>
         <w:r>
           <w:rPr>
@@ -2616,7 +2616,7 @@
           <w:lang w:eastAsia="en-IN"/>
         </w:rPr>
       </w:pPr>
-      <w:hyperlink w:anchor="_Toc243681833" w:history="1">
+      <w:hyperlink w:anchor="_Toc243682948" w:history="1">
         <w:r>
           <w:rPr>
             <w:rStyle w:val="Hyperlink"/>
@@ -2660,7 +2660,7 @@
             <w:noProof/>
             <w:webHidden/>
           </w:rPr>
-          <w:instrText xml:space="preserve"> PAGEREF _Toc243681833 \h </w:instrText>
+          <w:instrText xml:space="preserve"> PAGEREF _Toc243682948 \h </w:instrText>
         </w:r>
         <w:r>
           <w:rPr>
@@ -2704,7 +2704,7 @@
           <w:lang w:eastAsia="en-IN"/>
         </w:rPr>
       </w:pPr>
-      <w:hyperlink w:anchor="_Toc243681834" w:history="1">
+      <w:hyperlink w:anchor="_Toc243682949" w:history="1">
         <w:r>
           <w:rPr>
             <w:rStyle w:val="Hyperlink"/>
@@ -2748,7 +2748,7 @@
             <w:noProof/>
             <w:webHidden/>
           </w:rPr>
-          <w:instrText xml:space="preserve"> PAGEREF _Toc243681834 \h </w:instrText>
+          <w:instrText xml:space="preserve"> PAGEREF _Toc243682949 \h </w:instrText>
         </w:r>
         <w:r>
           <w:rPr>
@@ -2792,7 +2792,7 @@
           <w:lang w:eastAsia="en-IN"/>
         </w:rPr>
       </w:pPr>
-      <w:hyperlink w:anchor="_Toc243681835" w:history="1">
+      <w:hyperlink w:anchor="_Toc243682950" w:history="1">
         <w:r>
           <w:rPr>
             <w:rStyle w:val="Hyperlink"/>
@@ -2836,7 +2836,7 @@
             <w:noProof/>
             <w:webHidden/>
           </w:rPr>
-          <w:instrText xml:space="preserve"> PAGEREF _Toc243681835 \h </w:instrText>
+          <w:instrText xml:space="preserve"> PAGEREF _Toc243682950 \h </w:instrText>
         </w:r>
         <w:r>
           <w:rPr>
@@ -2880,7 +2880,7 @@
           <w:lang w:eastAsia="en-IN"/>
         </w:rPr>
       </w:pPr>
-      <w:hyperlink w:anchor="_Toc243681836" w:history="1">
+      <w:hyperlink w:anchor="_Toc243682951" w:history="1">
         <w:r>
           <w:rPr>
             <w:rStyle w:val="Hyperlink"/>
@@ -2922,7 +2922,7 @@
             <w:noProof/>
             <w:webHidden/>
           </w:rPr>
-          <w:instrText xml:space="preserve"> PAGEREF _Toc243681836 \h </w:instrText>
+          <w:instrText xml:space="preserve"> PAGEREF _Toc243682951 \h </w:instrText>
         </w:r>
         <w:r>
           <w:rPr>
@@ -2966,7 +2966,7 @@
           <w:lang w:eastAsia="en-IN"/>
         </w:rPr>
       </w:pPr>
-      <w:hyperlink w:anchor="_Toc243681837" w:history="1">
+      <w:hyperlink w:anchor="_Toc243682952" w:history="1">
         <w:r>
           <w:rPr>
             <w:rStyle w:val="Hyperlink"/>
@@ -3008,7 +3008,7 @@
             <w:noProof/>
             <w:webHidden/>
           </w:rPr>
-          <w:instrText xml:space="preserve"> PAGEREF _Toc243681837 \h </w:instrText>
+          <w:instrText xml:space="preserve"> PAGEREF _Toc243682952 \h </w:instrText>
         </w:r>
         <w:r>
           <w:rPr>
@@ -3052,7 +3052,7 @@
           <w:lang w:eastAsia="en-IN"/>
         </w:rPr>
       </w:pPr>
-      <w:hyperlink w:anchor="_Toc243681838" w:history="1">
+      <w:hyperlink w:anchor="_Toc243682953" w:history="1">
         <w:r>
           <w:rPr>
             <w:rStyle w:val="Hyperlink"/>
@@ -3094,7 +3094,7 @@
             <w:noProof/>
             <w:webHidden/>
           </w:rPr>
-          <w:instrText xml:space="preserve"> PAGEREF _Toc243681838 \h </w:instrText>
+          <w:instrText xml:space="preserve"> PAGEREF _Toc243682953 \h </w:instrText>
         </w:r>
         <w:r>
           <w:rPr>
@@ -3171,7 +3171,7 @@
       <w:r>
         <w:fldChar w:fldCharType="separate"/>
       </w:r>
-      <w:hyperlink w:anchor="_Toc243681839" w:history="1">
+      <w:hyperlink w:anchor="_Toc243682954" w:history="1">
         <w:r>
           <w:rPr>
             <w:rStyle w:val="Hyperlink"/>
@@ -3199,7 +3199,7 @@
             <w:noProof/>
             <w:webHidden/>
           </w:rPr>
-          <w:instrText xml:space="preserve"> PAGEREF _Toc243681839 \h </w:instrText>
+          <w:instrText xml:space="preserve"> PAGEREF _Toc243682954 \h </w:instrText>
         </w:r>
         <w:r>
           <w:rPr>
@@ -3242,7 +3242,7 @@
           <w:lang w:eastAsia="en-IN"/>
         </w:rPr>
       </w:pPr>
-      <w:hyperlink w:anchor="_Toc243681840" w:history="1">
+      <w:hyperlink w:anchor="_Toc243682955" w:history="1">
         <w:r>
           <w:rPr>
             <w:rStyle w:val="Hyperlink"/>
@@ -3270,7 +3270,7 @@
             <w:noProof/>
             <w:webHidden/>
           </w:rPr>
-          <w:instrText xml:space="preserve"> PAGEREF _Toc243681840 \h </w:instrText>
+          <w:instrText xml:space="preserve"> PAGEREF _Toc243682955 \h </w:instrText>
         </w:r>
         <w:r>
           <w:rPr>
@@ -3313,7 +3313,7 @@
           <w:lang w:eastAsia="en-IN"/>
         </w:rPr>
       </w:pPr>
-      <w:hyperlink w:anchor="_Toc243681841" w:history="1">
+      <w:hyperlink w:anchor="_Toc243682956" w:history="1">
         <w:r>
           <w:rPr>
             <w:rStyle w:val="Hyperlink"/>
@@ -3341,7 +3341,7 @@
             <w:noProof/>
             <w:webHidden/>
           </w:rPr>
-          <w:instrText xml:space="preserve"> PAGEREF _Toc243681841 \h </w:instrText>
+          <w:instrText xml:space="preserve"> PAGEREF _Toc243682956 \h </w:instrText>
         </w:r>
         <w:r>
           <w:rPr>
@@ -3417,7 +3417,7 @@
       <w:r>
         <w:fldChar w:fldCharType="separate"/>
       </w:r>
-      <w:hyperlink w:anchor="_Toc243681842" w:history="1">
+      <w:hyperlink w:anchor="_Toc243682957" w:history="1">
         <w:r>
           <w:rPr>
             <w:rStyle w:val="Hyperlink"/>
@@ -3445,7 +3445,7 @@
             <w:noProof/>
             <w:webHidden/>
           </w:rPr>
-          <w:instrText xml:space="preserve"> PAGEREF _Toc243681842 \h </w:instrText>
+          <w:instrText xml:space="preserve"> PAGEREF _Toc243682957 \h </w:instrText>
         </w:r>
         <w:r>
           <w:rPr>
@@ -3488,7 +3488,7 @@
           <w:lang w:eastAsia="en-IN"/>
         </w:rPr>
       </w:pPr>
-      <w:hyperlink w:anchor="_Toc243681843" w:history="1">
+      <w:hyperlink w:anchor="_Toc243682958" w:history="1">
         <w:r>
           <w:rPr>
             <w:rStyle w:val="Hyperlink"/>
@@ -3516,7 +3516,7 @@
             <w:noProof/>
             <w:webHidden/>
           </w:rPr>
-          <w:instrText xml:space="preserve"> PAGEREF _Toc243681843 \h </w:instrText>
+          <w:instrText xml:space="preserve"> PAGEREF _Toc243682958 \h </w:instrText>
         </w:r>
         <w:r>
           <w:rPr>
@@ -3559,7 +3559,7 @@
           <w:lang w:eastAsia="en-IN"/>
         </w:rPr>
       </w:pPr>
-      <w:hyperlink w:anchor="_Toc243681844" w:history="1">
+      <w:hyperlink w:anchor="_Toc243682959" w:history="1">
         <w:r>
           <w:rPr>
             <w:rStyle w:val="Hyperlink"/>
@@ -3587,7 +3587,7 @@
             <w:noProof/>
             <w:webHidden/>
           </w:rPr>
-          <w:instrText xml:space="preserve"> PAGEREF _Toc243681844 \h </w:instrText>
+          <w:instrText xml:space="preserve"> PAGEREF _Toc243682959 \h </w:instrText>
         </w:r>
         <w:r>
           <w:rPr>
@@ -3630,7 +3630,7 @@
           <w:lang w:eastAsia="en-IN"/>
         </w:rPr>
       </w:pPr>
-      <w:hyperlink w:anchor="_Toc243681845" w:history="1">
+      <w:hyperlink w:anchor="_Toc243682960" w:history="1">
         <w:r>
           <w:rPr>
             <w:rStyle w:val="Hyperlink"/>
@@ -3658,7 +3658,7 @@
             <w:noProof/>
             <w:webHidden/>
           </w:rPr>
-          <w:instrText xml:space="preserve"> PAGEREF _Toc243681845 \h </w:instrText>
+          <w:instrText xml:space="preserve"> PAGEREF _Toc243682960 \h </w:instrText>
         </w:r>
         <w:r>
           <w:rPr>
@@ -3710,7 +3710,7 @@
         <w:pStyle w:val="Heading1"/>
         <w:ind w:left="720" w:hanging="720"/>
       </w:pPr>
-      <w:bookmarkStart w:id="0" w:name="_Toc243681829"/>
+      <w:bookmarkStart w:id="0" w:name="_Toc243682944"/>
       <w:r>
         <w:lastRenderedPageBreak/>
         <w:t>What it is</w:t>
@@ -3746,7 +3746,7 @@
         <w:pStyle w:val="Heading1"/>
         <w:ind w:left="720" w:hanging="720"/>
       </w:pPr>
-      <w:bookmarkStart w:id="1" w:name="_Toc243681830"/>
+      <w:bookmarkStart w:id="1" w:name="_Toc243682945"/>
       <w:r>
         <w:lastRenderedPageBreak/>
         <w:t>Block diagram</w:t>
@@ -3764,7 +3764,7 @@
           <w:noProof/>
         </w:rPr>
         <w:drawing>
-          <wp:inline distT="0" distB="0" distL="0" distR="0" wp14:anchorId="025BA540" wp14:editId="10DF3835">
+          <wp:inline distT="0" distB="0" distL="0" distR="0" wp14:anchorId="72CF8977" wp14:editId="1ED99A6F">
             <wp:extent cx="5161445" cy="6119999"/>
             <wp:effectExtent l="0" t="0" r="0" b="0"/>
             <wp:docPr id="888501832" name="Picture 888501832"/>
@@ -3805,7 +3805,7 @@
         <w:pStyle w:val="Caption"/>
         <w:jc w:val="center"/>
       </w:pPr>
-      <w:bookmarkStart w:id="2" w:name="_Toc243681839"/>
+      <w:bookmarkStart w:id="2" w:name="_Toc243682954"/>
       <w:r>
         <w:rPr>
           <w:rFonts w:ascii="Times New Roman" w:eastAsia="Times New Roman" w:hAnsi="Times New Roman" w:cs="Times New Roman"/>
@@ -3856,7 +3856,7 @@
         <w:pStyle w:val="Heading1"/>
         <w:ind w:left="720" w:hanging="720"/>
       </w:pPr>
-      <w:bookmarkStart w:id="3" w:name="_Toc243681831"/>
+      <w:bookmarkStart w:id="3" w:name="_Toc243682946"/>
       <w:r>
         <w:t>Features</w:t>
       </w:r>
@@ -4715,7 +4715,7 @@
         <w:pStyle w:val="Caption"/>
         <w:jc w:val="center"/>
       </w:pPr>
-      <w:bookmarkStart w:id="4" w:name="_Toc243681842"/>
+      <w:bookmarkStart w:id="4" w:name="_Toc243682957"/>
       <w:r>
         <w:rPr>
           <w:rFonts w:ascii="Times New Roman" w:eastAsia="Times New Roman" w:hAnsi="Times New Roman" w:cs="Times New Roman"/>
@@ -4766,7 +4766,7 @@
         <w:pStyle w:val="Heading1"/>
         <w:ind w:left="720" w:hanging="720"/>
       </w:pPr>
-      <w:bookmarkStart w:id="5" w:name="_Toc243681832"/>
+      <w:bookmarkStart w:id="5" w:name="_Toc243682947"/>
       <w:r>
         <w:t>Main tests: how they work</w:t>
       </w:r>
@@ -4776,7 +4776,7 @@
       <w:pPr>
         <w:pStyle w:val="Heading2"/>
       </w:pPr>
-      <w:bookmarkStart w:id="6" w:name="_Toc243681833"/>
+      <w:bookmarkStart w:id="6" w:name="_Toc243682948"/>
       <w:r>
         <w:t>Continuity</w:t>
       </w:r>
@@ -4843,7 +4843,7 @@
       <w:pPr>
         <w:pStyle w:val="Heading2"/>
       </w:pPr>
-      <w:bookmarkStart w:id="7" w:name="_Toc243681834"/>
+      <w:bookmarkStart w:id="7" w:name="_Toc243682949"/>
       <w:r>
         <w:t>Resistance</w:t>
       </w:r>
@@ -4937,7 +4937,7 @@
         </w:rPr>
         <w:lastRenderedPageBreak/>
         <w:drawing>
-          <wp:inline distT="0" distB="0" distL="0" distR="0" wp14:anchorId="5E7C0652" wp14:editId="570B6A0E">
+          <wp:inline distT="0" distB="0" distL="0" distR="0" wp14:anchorId="1D066613" wp14:editId="1986A0E6">
             <wp:extent cx="5580000" cy="1913143"/>
             <wp:effectExtent l="0" t="0" r="0" b="0"/>
             <wp:docPr id="888501833" name="Picture 888501833"/>
@@ -4978,7 +4978,7 @@
         <w:pStyle w:val="Caption"/>
         <w:jc w:val="center"/>
       </w:pPr>
-      <w:bookmarkStart w:id="8" w:name="_Toc243681840"/>
+      <w:bookmarkStart w:id="8" w:name="_Toc243682955"/>
       <w:r>
         <w:rPr>
           <w:rFonts w:ascii="Times New Roman" w:eastAsia="Times New Roman" w:hAnsi="Times New Roman" w:cs="Times New Roman"/>
@@ -5047,7 +5047,7 @@
       <w:pPr>
         <w:pStyle w:val="Heading2"/>
       </w:pPr>
-      <w:bookmarkStart w:id="9" w:name="_Toc243681835"/>
+      <w:bookmarkStart w:id="9" w:name="_Toc243682950"/>
       <w:r>
         <w:t>Insulation (500 V)</w:t>
       </w:r>
@@ -5134,7 +5134,7 @@
         <w:pStyle w:val="Heading1"/>
         <w:ind w:left="720" w:hanging="720"/>
       </w:pPr>
-      <w:bookmarkStart w:id="10" w:name="_Toc243681836"/>
+      <w:bookmarkStart w:id="10" w:name="_Toc243682951"/>
       <w:r>
         <w:t>Pass and fail conditions</w:t>
       </w:r>
@@ -5529,7 +5529,7 @@
         <w:pStyle w:val="Caption"/>
         <w:jc w:val="center"/>
       </w:pPr>
-      <w:bookmarkStart w:id="11" w:name="_Toc243681843"/>
+      <w:bookmarkStart w:id="11" w:name="_Toc243682958"/>
       <w:r>
         <w:rPr>
           <w:rFonts w:ascii="Times New Roman" w:eastAsia="Times New Roman" w:hAnsi="Times New Roman" w:cs="Times New Roman"/>
@@ -5593,7 +5593,7 @@
         <w:pStyle w:val="Heading1"/>
         <w:ind w:left="720" w:hanging="720"/>
       </w:pPr>
-      <w:bookmarkStart w:id="12" w:name="_Toc243681837"/>
+      <w:bookmarkStart w:id="12" w:name="_Toc243682952"/>
       <w:r>
         <w:t>Support Tools</w:t>
       </w:r>
@@ -6058,7 +6058,7 @@
         <w:pStyle w:val="Caption"/>
         <w:jc w:val="center"/>
       </w:pPr>
-      <w:bookmarkStart w:id="13" w:name="_Toc243681844"/>
+      <w:bookmarkStart w:id="13" w:name="_Toc243682959"/>
       <w:r>
         <w:rPr>
           <w:rFonts w:ascii="Times New Roman" w:eastAsia="Times New Roman" w:hAnsi="Times New Roman" w:cs="Times New Roman"/>
@@ -6109,7 +6109,7 @@
         <w:pStyle w:val="Heading1"/>
         <w:ind w:left="720" w:hanging="720"/>
       </w:pPr>
-      <w:bookmarkStart w:id="14" w:name="_Toc243681838"/>
+      <w:bookmarkStart w:id="14" w:name="_Toc243682953"/>
       <w:r>
         <w:t>Pin support</w:t>
       </w:r>
@@ -6593,7 +6593,7 @@
         <w:pStyle w:val="Caption"/>
         <w:jc w:val="center"/>
       </w:pPr>
-      <w:bookmarkStart w:id="15" w:name="_Toc243681845"/>
+      <w:bookmarkStart w:id="15" w:name="_Toc243682960"/>
       <w:r>
         <w:rPr>
           <w:rFonts w:ascii="Times New Roman" w:eastAsia="Times New Roman" w:hAnsi="Times New Roman" w:cs="Times New Roman"/>
@@ -6651,7 +6651,7 @@
         </w:rPr>
         <w:lastRenderedPageBreak/>
         <w:drawing>
-          <wp:inline distT="0" distB="0" distL="0" distR="0" wp14:anchorId="6BF074FF" wp14:editId="02C559A5">
+          <wp:inline distT="0" distB="0" distL="0" distR="0" wp14:anchorId="5CD761A8" wp14:editId="4DCA5C85">
             <wp:extent cx="5580000" cy="3188571"/>
             <wp:effectExtent l="0" t="0" r="0" b="0"/>
             <wp:docPr id="888501834" name="Picture 888501834"/>
@@ -6692,7 +6692,7 @@
         <w:pStyle w:val="Caption"/>
         <w:jc w:val="center"/>
       </w:pPr>
-      <w:bookmarkStart w:id="16" w:name="_Toc243681841"/>
+      <w:bookmarkStart w:id="16" w:name="_Toc243682956"/>
       <w:r>
         <w:rPr>
           <w:rFonts w:ascii="Times New Roman" w:eastAsia="Times New Roman" w:hAnsi="Times New Roman" w:cs="Times New Roman"/>
@@ -6909,7 +6909,7 @@
         <w:sz w:val="18"/>
         <w:szCs w:val="18"/>
       </w:rPr>
-      <w:t>5</w:t>
+      <w:t>6</w:t>
     </w:r>
     <w:r>
       <w:rPr>
@@ -6918,7 +6918,7 @@
         <w:sz w:val="18"/>
         <w:szCs w:val="18"/>
       </w:rPr>
-      <w:t xml:space="preserve"> All Rights Reserved by </w:t>
+      <w:t xml:space="preserve"> All Rights Reserved by Atulya Core Tech (ACT)</w:t>
     </w:r>
   </w:p>
   <w:p>

</xml_diff>

<commit_message>
release: customer name Infinity Integrations Pvt Ltd in the GUI, ACT in the documents
- GUI footer credit and the header of every PDF test report carry the customer's company name,
  Infinity Integrations Pvt Ltd (single constant kCustomerName)
- documents are issued by Atulya Core Tech (ACT) (footer, properties) to Infinity Integrations
  Pvt Ltd (cover project line, distribution list); README and release notes updated
- screenshots re-rendered, customer GUI and demo executables rebuilt

Co-Authored-By: Claude Sonnet 5.5 <noreply@anthropic.com>
</commit_message>
<xml_diff>
--- a/Customer_Package/0_Documents/1_System_Overview.docx
+++ b/Customer_Package/0_Documents/1_System_Overview.docx
@@ -347,7 +347,7 @@
                 <w:rFonts w:ascii="Poppins" w:eastAsia="Poppins" w:hAnsi="Poppins" w:cs="Poppins"/>
                 <w:color w:val="000000" w:themeColor="text1"/>
               </w:rPr>
-              <w:t>HT_MK1 Harness Tester</w:t>
+              <w:t>HT_MK1 Harness Tester - Infinity Integrations Pvt Ltd</w:t>
             </w:r>
           </w:p>
         </w:tc>
@@ -1559,6 +1559,12 @@
                 <w:lang w:val="en-US"/>
               </w:rPr>
             </w:pPr>
+            <w:r>
+              <w:rPr>
+                <w:rFonts w:ascii="Times New Roman" w:eastAsia="Times New Roman" w:hAnsi="Times New Roman" w:cs="Times New Roman"/>
+              </w:rPr>
+              <w:t>Infinity Integrations Pvt Ltd</w:t>
+            </w:r>
           </w:p>
         </w:tc>
       </w:tr>
@@ -2272,7 +2278,7 @@
       <w:r>
         <w:fldChar w:fldCharType="separate"/>
       </w:r>
-      <w:hyperlink w:anchor="_Toc243682944" w:history="1">
+      <w:hyperlink w:anchor="_Toc243683378" w:history="1">
         <w:r>
           <w:rPr>
             <w:rStyle w:val="Hyperlink"/>
@@ -2314,7 +2320,7 @@
             <w:noProof/>
             <w:webHidden/>
           </w:rPr>
-          <w:instrText xml:space="preserve"> PAGEREF _Toc243682944 \h </w:instrText>
+          <w:instrText xml:space="preserve"> PAGEREF _Toc243683378 \h </w:instrText>
         </w:r>
         <w:r>
           <w:rPr>
@@ -2358,7 +2364,7 @@
           <w:lang w:eastAsia="en-IN"/>
         </w:rPr>
       </w:pPr>
-      <w:hyperlink w:anchor="_Toc243682945" w:history="1">
+      <w:hyperlink w:anchor="_Toc243683379" w:history="1">
         <w:r>
           <w:rPr>
             <w:rStyle w:val="Hyperlink"/>
@@ -2400,7 +2406,7 @@
             <w:noProof/>
             <w:webHidden/>
           </w:rPr>
-          <w:instrText xml:space="preserve"> PAGEREF _Toc243682945 \h </w:instrText>
+          <w:instrText xml:space="preserve"> PAGEREF _Toc243683379 \h </w:instrText>
         </w:r>
         <w:r>
           <w:rPr>
@@ -2444,7 +2450,7 @@
           <w:lang w:eastAsia="en-IN"/>
         </w:rPr>
       </w:pPr>
-      <w:hyperlink w:anchor="_Toc243682946" w:history="1">
+      <w:hyperlink w:anchor="_Toc243683380" w:history="1">
         <w:r>
           <w:rPr>
             <w:rStyle w:val="Hyperlink"/>
@@ -2486,7 +2492,7 @@
             <w:noProof/>
             <w:webHidden/>
           </w:rPr>
-          <w:instrText xml:space="preserve"> PAGEREF _Toc243682946 \h </w:instrText>
+          <w:instrText xml:space="preserve"> PAGEREF _Toc243683380 \h </w:instrText>
         </w:r>
         <w:r>
           <w:rPr>
@@ -2530,7 +2536,7 @@
           <w:lang w:eastAsia="en-IN"/>
         </w:rPr>
       </w:pPr>
-      <w:hyperlink w:anchor="_Toc243682947" w:history="1">
+      <w:hyperlink w:anchor="_Toc243683381" w:history="1">
         <w:r>
           <w:rPr>
             <w:rStyle w:val="Hyperlink"/>
@@ -2572,7 +2578,7 @@
             <w:noProof/>
             <w:webHidden/>
           </w:rPr>
-          <w:instrText xml:space="preserve"> PAGEREF _Toc243682947 \h </w:instrText>
+          <w:instrText xml:space="preserve"> PAGEREF _Toc243683381 \h </w:instrText>
         </w:r>
         <w:r>
           <w:rPr>
@@ -2616,7 +2622,7 @@
           <w:lang w:eastAsia="en-IN"/>
         </w:rPr>
       </w:pPr>
-      <w:hyperlink w:anchor="_Toc243682948" w:history="1">
+      <w:hyperlink w:anchor="_Toc243683382" w:history="1">
         <w:r>
           <w:rPr>
             <w:rStyle w:val="Hyperlink"/>
@@ -2660,7 +2666,7 @@
             <w:noProof/>
             <w:webHidden/>
           </w:rPr>
-          <w:instrText xml:space="preserve"> PAGEREF _Toc243682948 \h </w:instrText>
+          <w:instrText xml:space="preserve"> PAGEREF _Toc243683382 \h </w:instrText>
         </w:r>
         <w:r>
           <w:rPr>
@@ -2704,7 +2710,7 @@
           <w:lang w:eastAsia="en-IN"/>
         </w:rPr>
       </w:pPr>
-      <w:hyperlink w:anchor="_Toc243682949" w:history="1">
+      <w:hyperlink w:anchor="_Toc243683383" w:history="1">
         <w:r>
           <w:rPr>
             <w:rStyle w:val="Hyperlink"/>
@@ -2748,7 +2754,7 @@
             <w:noProof/>
             <w:webHidden/>
           </w:rPr>
-          <w:instrText xml:space="preserve"> PAGEREF _Toc243682949 \h </w:instrText>
+          <w:instrText xml:space="preserve"> PAGEREF _Toc243683383 \h </w:instrText>
         </w:r>
         <w:r>
           <w:rPr>
@@ -2792,7 +2798,7 @@
           <w:lang w:eastAsia="en-IN"/>
         </w:rPr>
       </w:pPr>
-      <w:hyperlink w:anchor="_Toc243682950" w:history="1">
+      <w:hyperlink w:anchor="_Toc243683384" w:history="1">
         <w:r>
           <w:rPr>
             <w:rStyle w:val="Hyperlink"/>
@@ -2836,7 +2842,7 @@
             <w:noProof/>
             <w:webHidden/>
           </w:rPr>
-          <w:instrText xml:space="preserve"> PAGEREF _Toc243682950 \h </w:instrText>
+          <w:instrText xml:space="preserve"> PAGEREF _Toc243683384 \h </w:instrText>
         </w:r>
         <w:r>
           <w:rPr>
@@ -2880,7 +2886,7 @@
           <w:lang w:eastAsia="en-IN"/>
         </w:rPr>
       </w:pPr>
-      <w:hyperlink w:anchor="_Toc243682951" w:history="1">
+      <w:hyperlink w:anchor="_Toc243683385" w:history="1">
         <w:r>
           <w:rPr>
             <w:rStyle w:val="Hyperlink"/>
@@ -2922,7 +2928,7 @@
             <w:noProof/>
             <w:webHidden/>
           </w:rPr>
-          <w:instrText xml:space="preserve"> PAGEREF _Toc243682951 \h </w:instrText>
+          <w:instrText xml:space="preserve"> PAGEREF _Toc243683385 \h </w:instrText>
         </w:r>
         <w:r>
           <w:rPr>
@@ -2966,7 +2972,7 @@
           <w:lang w:eastAsia="en-IN"/>
         </w:rPr>
       </w:pPr>
-      <w:hyperlink w:anchor="_Toc243682952" w:history="1">
+      <w:hyperlink w:anchor="_Toc243683386" w:history="1">
         <w:r>
           <w:rPr>
             <w:rStyle w:val="Hyperlink"/>
@@ -3008,7 +3014,7 @@
             <w:noProof/>
             <w:webHidden/>
           </w:rPr>
-          <w:instrText xml:space="preserve"> PAGEREF _Toc243682952 \h </w:instrText>
+          <w:instrText xml:space="preserve"> PAGEREF _Toc243683386 \h </w:instrText>
         </w:r>
         <w:r>
           <w:rPr>
@@ -3052,7 +3058,7 @@
           <w:lang w:eastAsia="en-IN"/>
         </w:rPr>
       </w:pPr>
-      <w:hyperlink w:anchor="_Toc243682953" w:history="1">
+      <w:hyperlink w:anchor="_Toc243683387" w:history="1">
         <w:r>
           <w:rPr>
             <w:rStyle w:val="Hyperlink"/>
@@ -3094,7 +3100,7 @@
             <w:noProof/>
             <w:webHidden/>
           </w:rPr>
-          <w:instrText xml:space="preserve"> PAGEREF _Toc243682953 \h </w:instrText>
+          <w:instrText xml:space="preserve"> PAGEREF _Toc243683387 \h </w:instrText>
         </w:r>
         <w:r>
           <w:rPr>
@@ -3171,7 +3177,7 @@
       <w:r>
         <w:fldChar w:fldCharType="separate"/>
       </w:r>
-      <w:hyperlink w:anchor="_Toc243682954" w:history="1">
+      <w:hyperlink w:anchor="_Toc243683388" w:history="1">
         <w:r>
           <w:rPr>
             <w:rStyle w:val="Hyperlink"/>
@@ -3199,7 +3205,7 @@
             <w:noProof/>
             <w:webHidden/>
           </w:rPr>
-          <w:instrText xml:space="preserve"> PAGEREF _Toc243682954 \h </w:instrText>
+          <w:instrText xml:space="preserve"> PAGEREF _Toc243683388 \h </w:instrText>
         </w:r>
         <w:r>
           <w:rPr>
@@ -3242,7 +3248,7 @@
           <w:lang w:eastAsia="en-IN"/>
         </w:rPr>
       </w:pPr>
-      <w:hyperlink w:anchor="_Toc243682955" w:history="1">
+      <w:hyperlink w:anchor="_Toc243683389" w:history="1">
         <w:r>
           <w:rPr>
             <w:rStyle w:val="Hyperlink"/>
@@ -3270,7 +3276,7 @@
             <w:noProof/>
             <w:webHidden/>
           </w:rPr>
-          <w:instrText xml:space="preserve"> PAGEREF _Toc243682955 \h </w:instrText>
+          <w:instrText xml:space="preserve"> PAGEREF _Toc243683389 \h </w:instrText>
         </w:r>
         <w:r>
           <w:rPr>
@@ -3313,7 +3319,7 @@
           <w:lang w:eastAsia="en-IN"/>
         </w:rPr>
       </w:pPr>
-      <w:hyperlink w:anchor="_Toc243682956" w:history="1">
+      <w:hyperlink w:anchor="_Toc243683390" w:history="1">
         <w:r>
           <w:rPr>
             <w:rStyle w:val="Hyperlink"/>
@@ -3341,7 +3347,7 @@
             <w:noProof/>
             <w:webHidden/>
           </w:rPr>
-          <w:instrText xml:space="preserve"> PAGEREF _Toc243682956 \h </w:instrText>
+          <w:instrText xml:space="preserve"> PAGEREF _Toc243683390 \h </w:instrText>
         </w:r>
         <w:r>
           <w:rPr>
@@ -3417,7 +3423,7 @@
       <w:r>
         <w:fldChar w:fldCharType="separate"/>
       </w:r>
-      <w:hyperlink w:anchor="_Toc243682957" w:history="1">
+      <w:hyperlink w:anchor="_Toc243683391" w:history="1">
         <w:r>
           <w:rPr>
             <w:rStyle w:val="Hyperlink"/>
@@ -3445,7 +3451,7 @@
             <w:noProof/>
             <w:webHidden/>
           </w:rPr>
-          <w:instrText xml:space="preserve"> PAGEREF _Toc243682957 \h </w:instrText>
+          <w:instrText xml:space="preserve"> PAGEREF _Toc243683391 \h </w:instrText>
         </w:r>
         <w:r>
           <w:rPr>
@@ -3488,7 +3494,7 @@
           <w:lang w:eastAsia="en-IN"/>
         </w:rPr>
       </w:pPr>
-      <w:hyperlink w:anchor="_Toc243682958" w:history="1">
+      <w:hyperlink w:anchor="_Toc243683392" w:history="1">
         <w:r>
           <w:rPr>
             <w:rStyle w:val="Hyperlink"/>
@@ -3516,7 +3522,7 @@
             <w:noProof/>
             <w:webHidden/>
           </w:rPr>
-          <w:instrText xml:space="preserve"> PAGEREF _Toc243682958 \h </w:instrText>
+          <w:instrText xml:space="preserve"> PAGEREF _Toc243683392 \h </w:instrText>
         </w:r>
         <w:r>
           <w:rPr>
@@ -3559,7 +3565,7 @@
           <w:lang w:eastAsia="en-IN"/>
         </w:rPr>
       </w:pPr>
-      <w:hyperlink w:anchor="_Toc243682959" w:history="1">
+      <w:hyperlink w:anchor="_Toc243683393" w:history="1">
         <w:r>
           <w:rPr>
             <w:rStyle w:val="Hyperlink"/>
@@ -3587,7 +3593,7 @@
             <w:noProof/>
             <w:webHidden/>
           </w:rPr>
-          <w:instrText xml:space="preserve"> PAGEREF _Toc243682959 \h </w:instrText>
+          <w:instrText xml:space="preserve"> PAGEREF _Toc243683393 \h </w:instrText>
         </w:r>
         <w:r>
           <w:rPr>
@@ -3630,7 +3636,7 @@
           <w:lang w:eastAsia="en-IN"/>
         </w:rPr>
       </w:pPr>
-      <w:hyperlink w:anchor="_Toc243682960" w:history="1">
+      <w:hyperlink w:anchor="_Toc243683394" w:history="1">
         <w:r>
           <w:rPr>
             <w:rStyle w:val="Hyperlink"/>
@@ -3658,7 +3664,7 @@
             <w:noProof/>
             <w:webHidden/>
           </w:rPr>
-          <w:instrText xml:space="preserve"> PAGEREF _Toc243682960 \h </w:instrText>
+          <w:instrText xml:space="preserve"> PAGEREF _Toc243683394 \h </w:instrText>
         </w:r>
         <w:r>
           <w:rPr>
@@ -3710,7 +3716,7 @@
         <w:pStyle w:val="Heading1"/>
         <w:ind w:left="720" w:hanging="720"/>
       </w:pPr>
-      <w:bookmarkStart w:id="0" w:name="_Toc243682944"/>
+      <w:bookmarkStart w:id="0" w:name="_Toc243683378"/>
       <w:r>
         <w:lastRenderedPageBreak/>
         <w:t>What it is</w:t>
@@ -3746,7 +3752,7 @@
         <w:pStyle w:val="Heading1"/>
         <w:ind w:left="720" w:hanging="720"/>
       </w:pPr>
-      <w:bookmarkStart w:id="1" w:name="_Toc243682945"/>
+      <w:bookmarkStart w:id="1" w:name="_Toc243683379"/>
       <w:r>
         <w:lastRenderedPageBreak/>
         <w:t>Block diagram</w:t>
@@ -3764,7 +3770,7 @@
           <w:noProof/>
         </w:rPr>
         <w:drawing>
-          <wp:inline distT="0" distB="0" distL="0" distR="0" wp14:anchorId="72CF8977" wp14:editId="1ED99A6F">
+          <wp:inline distT="0" distB="0" distL="0" distR="0" wp14:anchorId="2C8D7E9D" wp14:editId="4B3F0921">
             <wp:extent cx="5161445" cy="6119999"/>
             <wp:effectExtent l="0" t="0" r="0" b="0"/>
             <wp:docPr id="888501832" name="Picture 888501832"/>
@@ -3805,7 +3811,7 @@
         <w:pStyle w:val="Caption"/>
         <w:jc w:val="center"/>
       </w:pPr>
-      <w:bookmarkStart w:id="2" w:name="_Toc243682954"/>
+      <w:bookmarkStart w:id="2" w:name="_Toc243683388"/>
       <w:r>
         <w:rPr>
           <w:rFonts w:ascii="Times New Roman" w:eastAsia="Times New Roman" w:hAnsi="Times New Roman" w:cs="Times New Roman"/>
@@ -3856,7 +3862,7 @@
         <w:pStyle w:val="Heading1"/>
         <w:ind w:left="720" w:hanging="720"/>
       </w:pPr>
-      <w:bookmarkStart w:id="3" w:name="_Toc243682946"/>
+      <w:bookmarkStart w:id="3" w:name="_Toc243683380"/>
       <w:r>
         <w:t>Features</w:t>
       </w:r>
@@ -4715,7 +4721,7 @@
         <w:pStyle w:val="Caption"/>
         <w:jc w:val="center"/>
       </w:pPr>
-      <w:bookmarkStart w:id="4" w:name="_Toc243682957"/>
+      <w:bookmarkStart w:id="4" w:name="_Toc243683391"/>
       <w:r>
         <w:rPr>
           <w:rFonts w:ascii="Times New Roman" w:eastAsia="Times New Roman" w:hAnsi="Times New Roman" w:cs="Times New Roman"/>
@@ -4766,7 +4772,7 @@
         <w:pStyle w:val="Heading1"/>
         <w:ind w:left="720" w:hanging="720"/>
       </w:pPr>
-      <w:bookmarkStart w:id="5" w:name="_Toc243682947"/>
+      <w:bookmarkStart w:id="5" w:name="_Toc243683381"/>
       <w:r>
         <w:t>Main tests: how they work</w:t>
       </w:r>
@@ -4776,7 +4782,7 @@
       <w:pPr>
         <w:pStyle w:val="Heading2"/>
       </w:pPr>
-      <w:bookmarkStart w:id="6" w:name="_Toc243682948"/>
+      <w:bookmarkStart w:id="6" w:name="_Toc243683382"/>
       <w:r>
         <w:t>Continuity</w:t>
       </w:r>
@@ -4843,7 +4849,7 @@
       <w:pPr>
         <w:pStyle w:val="Heading2"/>
       </w:pPr>
-      <w:bookmarkStart w:id="7" w:name="_Toc243682949"/>
+      <w:bookmarkStart w:id="7" w:name="_Toc243683383"/>
       <w:r>
         <w:t>Resistance</w:t>
       </w:r>
@@ -4937,7 +4943,7 @@
         </w:rPr>
         <w:lastRenderedPageBreak/>
         <w:drawing>
-          <wp:inline distT="0" distB="0" distL="0" distR="0" wp14:anchorId="1D066613" wp14:editId="1986A0E6">
+          <wp:inline distT="0" distB="0" distL="0" distR="0" wp14:anchorId="4C4E0464" wp14:editId="680B3C27">
             <wp:extent cx="5580000" cy="1913143"/>
             <wp:effectExtent l="0" t="0" r="0" b="0"/>
             <wp:docPr id="888501833" name="Picture 888501833"/>
@@ -4978,7 +4984,7 @@
         <w:pStyle w:val="Caption"/>
         <w:jc w:val="center"/>
       </w:pPr>
-      <w:bookmarkStart w:id="8" w:name="_Toc243682955"/>
+      <w:bookmarkStart w:id="8" w:name="_Toc243683389"/>
       <w:r>
         <w:rPr>
           <w:rFonts w:ascii="Times New Roman" w:eastAsia="Times New Roman" w:hAnsi="Times New Roman" w:cs="Times New Roman"/>
@@ -5047,7 +5053,7 @@
       <w:pPr>
         <w:pStyle w:val="Heading2"/>
       </w:pPr>
-      <w:bookmarkStart w:id="9" w:name="_Toc243682950"/>
+      <w:bookmarkStart w:id="9" w:name="_Toc243683384"/>
       <w:r>
         <w:t>Insulation (500 V)</w:t>
       </w:r>
@@ -5134,7 +5140,7 @@
         <w:pStyle w:val="Heading1"/>
         <w:ind w:left="720" w:hanging="720"/>
       </w:pPr>
-      <w:bookmarkStart w:id="10" w:name="_Toc243682951"/>
+      <w:bookmarkStart w:id="10" w:name="_Toc243683385"/>
       <w:r>
         <w:t>Pass and fail conditions</w:t>
       </w:r>
@@ -5529,7 +5535,7 @@
         <w:pStyle w:val="Caption"/>
         <w:jc w:val="center"/>
       </w:pPr>
-      <w:bookmarkStart w:id="11" w:name="_Toc243682958"/>
+      <w:bookmarkStart w:id="11" w:name="_Toc243683392"/>
       <w:r>
         <w:rPr>
           <w:rFonts w:ascii="Times New Roman" w:eastAsia="Times New Roman" w:hAnsi="Times New Roman" w:cs="Times New Roman"/>
@@ -5593,7 +5599,7 @@
         <w:pStyle w:val="Heading1"/>
         <w:ind w:left="720" w:hanging="720"/>
       </w:pPr>
-      <w:bookmarkStart w:id="12" w:name="_Toc243682952"/>
+      <w:bookmarkStart w:id="12" w:name="_Toc243683386"/>
       <w:r>
         <w:t>Support Tools</w:t>
       </w:r>
@@ -6058,7 +6064,7 @@
         <w:pStyle w:val="Caption"/>
         <w:jc w:val="center"/>
       </w:pPr>
-      <w:bookmarkStart w:id="13" w:name="_Toc243682959"/>
+      <w:bookmarkStart w:id="13" w:name="_Toc243683393"/>
       <w:r>
         <w:rPr>
           <w:rFonts w:ascii="Times New Roman" w:eastAsia="Times New Roman" w:hAnsi="Times New Roman" w:cs="Times New Roman"/>
@@ -6109,7 +6115,7 @@
         <w:pStyle w:val="Heading1"/>
         <w:ind w:left="720" w:hanging="720"/>
       </w:pPr>
-      <w:bookmarkStart w:id="14" w:name="_Toc243682953"/>
+      <w:bookmarkStart w:id="14" w:name="_Toc243683387"/>
       <w:r>
         <w:t>Pin support</w:t>
       </w:r>
@@ -6593,7 +6599,7 @@
         <w:pStyle w:val="Caption"/>
         <w:jc w:val="center"/>
       </w:pPr>
-      <w:bookmarkStart w:id="15" w:name="_Toc243682960"/>
+      <w:bookmarkStart w:id="15" w:name="_Toc243683394"/>
       <w:r>
         <w:rPr>
           <w:rFonts w:ascii="Times New Roman" w:eastAsia="Times New Roman" w:hAnsi="Times New Roman" w:cs="Times New Roman"/>
@@ -6651,7 +6657,7 @@
         </w:rPr>
         <w:lastRenderedPageBreak/>
         <w:drawing>
-          <wp:inline distT="0" distB="0" distL="0" distR="0" wp14:anchorId="5CD761A8" wp14:editId="4DCA5C85">
+          <wp:inline distT="0" distB="0" distL="0" distR="0" wp14:anchorId="120F9D7B" wp14:editId="7C192E14">
             <wp:extent cx="5580000" cy="3188571"/>
             <wp:effectExtent l="0" t="0" r="0" b="0"/>
             <wp:docPr id="888501834" name="Picture 888501834"/>
@@ -6692,7 +6698,7 @@
         <w:pStyle w:val="Caption"/>
         <w:jc w:val="center"/>
       </w:pPr>
-      <w:bookmarkStart w:id="16" w:name="_Toc243682956"/>
+      <w:bookmarkStart w:id="16" w:name="_Toc243683390"/>
       <w:r>
         <w:rPr>
           <w:rFonts w:ascii="Times New Roman" w:eastAsia="Times New Roman" w:hAnsi="Times New Roman" w:cs="Times New Roman"/>

</xml_diff>